<commit_message>
Finalize report links and narrative
</commit_message>
<xml_diff>
--- a/report/report.docx
+++ b/report/report.docx
@@ -74,7 +74,7 @@
           <w:color w:val="64748B"/>
           <w:sz w:val="17"/>
         </w:rPr>
-        <w:t>Out-of-sample fund evidence: 1 January 2021 to 31 December 2023</w:t>
+        <w:t>Out-of-sample fund evidence: January 2021 to December 2023</w:t>
       </w:r>
     </w:p>
     <w:p>
@@ -1605,7 +1605,7 @@
         <w:rPr>
           <w:rFonts w:ascii="Calibri" w:hAnsi="Calibri"/>
         </w:rPr>
-        <w:t>Equal Weight is a transparent baseline. Minimum Variance minimises forecast portfolio variance. Maximum Sharpe maximises expected excess return per unit of volatility with a zero risk-free rate. Risk Parity minimises differences between assets' variance contributions. All targets are long-only and fully invested. To reduce estimation noise, annualised means are shrunk 50% toward the cross-sectional mean and the sample covariance is shrunk 10% toward its diagonal. Assets need at least 80% of the trailing window; any remaining gaps would be filled by that asset's window mean. Combined moments use already-computed crypto daily returns observed on equity dates and are annualised at 252 periods; crypto-only moments use the full seven-day series and 365.</w:t>
+        <w:t>Equal Weight is a transparent baseline. Minimum Variance minimises forecast portfolio variance. Maximum Sharpe maximises expected excess return per unit of volatility with a zero risk-free rate. Risk Parity minimises differences between assets' variance contributions. All targets are long-only and fully invested. To reduce estimation noise, annualised means are shrunk 50% toward the cross-sectional mean and the sample covariance is shrunk 10% toward its diagonal. Combined funds estimate risk on equity dates and annualise at 252 periods; crypto-only funds use the full seven-day series and 365. Appendix F reports the data-availability and fallback audit.</w:t>
       </w:r>
     </w:p>
     <w:p>
@@ -1647,7 +1647,7 @@
         <w:rPr>
           <w:rFonts w:ascii="Calibri" w:hAnsi="Calibri"/>
         </w:rPr>
-        <w:t>The final pipeline passes 23 of 23 checks covering unique keys, first-return boundaries, forward-only headline alignment, 12 fund identities, long-only weights summing to one, strict estimation timing, method differentiation, solver reliability, sentiment bounds, signal-calendar coverage, risk-contribution reconciliation, annual outputs, and fusion weights. Across 1,129,320 repeated estimation-window cells, 0 are mean-filled and no asset-window fails the 80% coverage rule. There are 1 solver fallback event(s). On failure or a non-finite SLSQP solution, the same cap is applied to inverse variance for Minimum Variance, positive mean divided by variance for Maximum Sharpe, or inverse volatility for Risk Parity.</w:t>
+        <w:t>All 23 pipeline checks pass. No return observation is imputed and no asset-window is excluded for insufficient data. Appendices C and F report the check-level evidence and the single solver fallback across 1,129,320 repeated estimation-window cells.</w:t>
       </w:r>
     </w:p>
     <w:p>
@@ -4494,7 +4494,7 @@
         <w:rPr>
           <w:rFonts w:ascii="Calibri" w:hAnsi="Calibri"/>
         </w:rPr>
-        <w:t xml:space="preserve"> shows capital allocation, but capital weight is not risk weight. The diagnostic below uses each rebalance's same 252-period, diagonally shrunk combined covariance matrix to decompose target variance into equity and crypto components.</w:t>
+        <w:t xml:space="preserve"> shows capital allocation, but capital weight is not risk weight. The diagnostic below estimates how much equity and crypto contribute to portfolio variance at each rebalance, using the same covariance estimate as fund construction.</w:t>
       </w:r>
     </w:p>
     <w:p>
@@ -5552,7 +5552,7 @@
         <w:rPr>
           <w:rFonts w:ascii="Calibri" w:hAnsi="Calibri"/>
         </w:rPr>
-        <w:t>The finance extension adds 20 reviewed words, 9 reviewed phrases, and 5 intensity modifiers from the Week 8 ten-rater exercise. The code snapshots and restores VADER's module dictionaries so repeated runs do not contaminate the baseline. Headline scores are averaged within ticker-day first; observed ticker-day means are then equally weighted within sector. No-news observations remain missing in the headline index, while a separate neutral-fill series multiplies observed tone by ticker coverage.</w:t>
+        <w:t>The finance extension adds 20 reviewed words, 9 reviewed phrases, and 5 intensity modifiers from the Week 8 ten-rater exercise. Headline scores are averaged within each ticker-day before observed ticker scores are equally weighted within sectors. No-news observations remain missing in the headline index; coverage is reported separately so investors can distinguish broad tone from a reading based on few companies.</w:t>
       </w:r>
     </w:p>
     <w:p>
@@ -6410,7 +6410,7 @@
         <w:rPr>
           <w:rFonts w:ascii="Calibri" w:hAnsi="Calibri"/>
         </w:rPr>
-        <w:t>The fusion starts from Equity Risk Parity. For each ticker, the model forms a 21-trading-day mean headline score, lags both tone and coverage by one trading day, standardises available tone across tickers, and scales the z-score by the square root of lagged coverage. At each monthly rebalance, the base target is multiplied by exp(0.30 times the effective signal) and projected back to the long-only 15% cap. Saturday and Monday headlines aligned to Monday can therefore first influence Tuesday; a Monday rebalance never uses Monday coverage.</w:t>
+        <w:t>The fusion starts from Equity Risk Parity. A 21-trading-day ticker sentiment signal is lagged one trading day and discounted when news coverage is thin. At each monthly rebalance, a 0.30 exponential tilt adjusts the base target before the long-only 15% cap is reapplied. Lagging both tone and coverage prevents same-day news from influencing a rebalance.</w:t>
       </w:r>
     </w:p>
     <w:p>
@@ -7267,7 +7267,7 @@
         <w:pStyle w:val="Heading2"/>
       </w:pPr>
       <w:r>
-        <w:t>A lightweight deployment architecture</w:t>
+        <w:t>A live investor product</w:t>
       </w:r>
     </w:p>
     <w:p>
@@ -7276,7 +7276,7 @@
         <w:rPr>
           <w:rFonts w:ascii="Calibri" w:hAnsi="Calibri"/>
         </w:rPr>
-        <w:t>The root Streamlit entrypoint reads committed CSV and JSON artifacts only. It does not download raw data, run VADER, solve an optimisation, or backtest on a viewer's machine. A cached loader validates required columns and dates before any page renders. Pure data helpers calculate current holdings and custom fund-level allocations; chart helpers apply one Plotly design system. URL query parameters preserve the active view, and every investor-facing table or simulated path can be downloaded. Combined fact sheets expose capital versus covariance-risk shares; the allocation lab aggregates latest targets to show equity-versus-crypto capital exposure, major equity sectors, top underlying holdings, effective holdings, and top-five concentration. All five views pass headless AppTest. The app is live on Streamlit Community Cloud and deployed from the main branch of the public GitHub repository.</w:t>
+        <w:t>The live app serves the same audited results as this report, so investors can compare all 12 funds without rebuilding the portfolios. Each fact sheet links return and drawdown to current targets; combined-fund views distinguish capital allocation from risk contribution. The Allocation Lab adds equity-versus-crypto exposure, major sectors, top underlying holdings, effective holdings, and top-five concentration. Sentiment is shown beside coverage, and investor-facing tables and simulated paths are downloadable. The app is live on Streamlit Community Cloud from the public repository's main branch.</w:t>
       </w:r>
     </w:p>
     <w:p>
@@ -7370,13 +7370,13 @@
           <w:b/>
           <w:color w:val="16324F"/>
         </w:rPr>
-        <w:t xml:space="preserve">Add implementation realism before accepting client capital. </w:t>
+        <w:t xml:space="preserve">Strengthen implementation realism. </w:t>
       </w:r>
       <w:r>
         <w:rPr>
           <w:rFonts w:ascii="Calibri" w:hAnsi="Calibri"/>
         </w:rPr>
-        <w:t>Quote trading-cost-adjusted and management-fee-adjusted returns separately, publish look-through overlap and concentration, and stress spreads, slippage, capacity, and rebalance timing before accepting client capital.</w:t>
+        <w:t>Quote trading-cost-adjusted and management-fee-adjusted returns separately, publish look-through overlap and concentration, and stress spreads, slippage, capacity, and rebalance timing before offering the product to clients.</w:t>
       </w:r>
     </w:p>
     <w:p>
@@ -7458,7 +7458,7 @@
         <w:rPr>
           <w:rFonts w:ascii="Calibri" w:hAnsi="Calibri"/>
         </w:rPr>
-        <w:t>Live app: https://marketready-funds-ustakylve9nywmyokqp4q4.streamlit.app/</w:t>
+        <w:t>Live app: https://z5603162projectb-zdwhgwh2jhcput7tn6w2ku.streamlit.app/</w:t>
       </w:r>
     </w:p>
     <w:p>
@@ -7467,7 +7467,7 @@
         <w:rPr>
           <w:rFonts w:ascii="Calibri" w:hAnsi="Calibri"/>
         </w:rPr>
-        <w:t>Public GitHub repository: https://github.com/lgua9087/marketready-funds</w:t>
+        <w:t>Public GitHub repository: https://github.com/lgua9087/z5603162_projectB</w:t>
       </w:r>
     </w:p>
     <w:p>

</xml_diff>